<commit_message>
audit: migração paleta Nunito+Navy+Blue+Gold + fixes UX + API hardening
</commit_message>
<xml_diff>
--- a/Plano_de_Negocio_GoLivoo_v2.docx
+++ b/Plano_de_Negocio_GoLivoo_v2.docx
@@ -7394,6 +7394,497 @@
           <w:szCs w:val="22"/>
         </w:rPr>
         <w:t xml:space="preserve">R$ 20.000-50.000 em setup jurídico/regulatório, mais custo operacional mensal significativamente maior (atendimento, compliance, seguros). Essa fase só é recomendada quando a receita mensal já sustenta o negócio confortavelmente na Fase 2.</w:t>
+      </w:r>
+    </w:p>
+    <w:p>
+      <w:pPr>
+        <w:pStyle w:val="Heading2"/>
+        <w:spacing w:after="160" w:before="280"/>
+      </w:pPr>
+      <w:r>
+        <w:rPr>
+          <w:rFonts w:ascii="Arial" w:cs="Arial" w:eastAsia="Arial" w:hAnsi="Arial"/>
+          <w:b/>
+          <w:bCs/>
+          <w:color w:val="2E86AB"/>
+          <w:sz w:val="26"/>
+          <w:szCs w:val="26"/>
+        </w:rPr>
+        <w:t xml:space="preserve">6.4 Roadmap Futuro — Sistema de Monitoramento Automatizado de Preços</w:t>
+      </w:r>
+    </w:p>
+    <w:p>
+      <w:pPr>
+        <w:spacing w:after="160" w:line="320"/>
+        <w:jc w:val="both"/>
+      </w:pPr>
+      <w:r>
+        <w:rPr>
+          <w:rFonts w:ascii="Arial" w:cs="Arial" w:eastAsia="Arial" w:hAnsi="Arial"/>
+          <w:sz w:val="22"/>
+          <w:szCs w:val="22"/>
+        </w:rPr>
+        <w:t xml:space="preserve">Inspirado no modelo de sucesso do Melhores Destinos e Passagens Promo, a Go Livoo planeja implementar um sistema progressivo de monitoramento de preços que gere alertas e push notifications para os usuários. Esse sistema é um diferencial competitivo poderoso: transforma o site de destino de consulta em ferramenta de uso diário.</w:t>
+      </w:r>
+    </w:p>
+    <w:p>
+      <w:pPr>
+        <w:pStyle w:val="Heading3"/>
+        <w:spacing w:after="120" w:before="200"/>
+      </w:pPr>
+      <w:r>
+        <w:rPr>
+          <w:rFonts w:ascii="Arial" w:cs="Arial" w:eastAsia="Arial" w:hAnsi="Arial"/>
+          <w:b/>
+          <w:bCs/>
+          <w:color w:val="1B3A4B"/>
+          <w:sz w:val="22"/>
+          <w:szCs w:val="22"/>
+        </w:rPr>
+        <w:t xml:space="preserve">Etapa 1 — Manual e Curadoria (Meses 1-4)</w:t>
+      </w:r>
+    </w:p>
+    <w:p>
+      <w:pPr>
+        <w:spacing w:after="160" w:line="320"/>
+        <w:jc w:val="both"/>
+      </w:pPr>
+      <w:r>
+        <w:rPr>
+          <w:rFonts w:ascii="Arial" w:cs="Arial" w:eastAsia="Arial" w:hAnsi="Arial"/>
+          <w:b/>
+          <w:bCs/>
+          <w:sz w:val="22"/>
+          <w:szCs w:val="22"/>
+        </w:rPr>
+        <w:t xml:space="preserve">Investimento: </w:t>
+      </w:r>
+      <w:r>
+        <w:rPr>
+          <w:rFonts w:ascii="Arial" w:cs="Arial" w:eastAsia="Arial" w:hAnsi="Arial"/>
+          <w:sz w:val="22"/>
+          <w:szCs w:val="22"/>
+        </w:rPr>
+        <w:t xml:space="preserve">Zero (apenas tempo)</w:t>
+      </w:r>
+    </w:p>
+    <w:p>
+      <w:pPr>
+        <w:pStyle w:val="ListParagraph"/>
+        <w:numPr>
+          <w:ilvl w:val="0"/>
+          <w:numId w:val="2"/>
+        </w:numPr>
+        <w:spacing w:after="80" w:line="320"/>
+      </w:pPr>
+      <w:r>
+        <w:rPr>
+          <w:rFonts w:ascii="Arial" w:cs="Arial" w:eastAsia="Arial" w:hAnsi="Arial"/>
+          <w:sz w:val="22"/>
+          <w:szCs w:val="22"/>
+        </w:rPr>
+        <w:t xml:space="preserve">Monitoramento manual via Google Flights, Skyscanner e Travelpayouts</w:t>
+      </w:r>
+    </w:p>
+    <w:p>
+      <w:pPr>
+        <w:pStyle w:val="ListParagraph"/>
+        <w:numPr>
+          <w:ilvl w:val="0"/>
+          <w:numId w:val="2"/>
+        </w:numPr>
+        <w:spacing w:after="80" w:line="320"/>
+      </w:pPr>
+      <w:r>
+        <w:rPr>
+          <w:rFonts w:ascii="Arial" w:cs="Arial" w:eastAsia="Arial" w:hAnsi="Arial"/>
+          <w:sz w:val="22"/>
+          <w:szCs w:val="22"/>
+        </w:rPr>
+        <w:t xml:space="preserve">Curadoria humana: verificar preços anormalmente baixos e criar posts no blog</w:t>
+      </w:r>
+    </w:p>
+    <w:p>
+      <w:pPr>
+        <w:pStyle w:val="ListParagraph"/>
+        <w:numPr>
+          <w:ilvl w:val="0"/>
+          <w:numId w:val="2"/>
+        </w:numPr>
+        <w:spacing w:after="80" w:line="320"/>
+      </w:pPr>
+      <w:r>
+        <w:rPr>
+          <w:rFonts w:ascii="Arial" w:cs="Arial" w:eastAsia="Arial" w:hAnsi="Arial"/>
+          <w:sz w:val="22"/>
+          <w:szCs w:val="22"/>
+        </w:rPr>
+        <w:t xml:space="preserve">Formato: artigos “Alerta de Preço: [Destino] por R$ [valor]”</w:t>
+      </w:r>
+    </w:p>
+    <w:p>
+      <w:pPr>
+        <w:pStyle w:val="ListParagraph"/>
+        <w:numPr>
+          <w:ilvl w:val="0"/>
+          <w:numId w:val="2"/>
+        </w:numPr>
+        <w:spacing w:after="80" w:line="320"/>
+      </w:pPr>
+      <w:r>
+        <w:rPr>
+          <w:rFonts w:ascii="Arial" w:cs="Arial" w:eastAsia="Arial" w:hAnsi="Arial"/>
+          <w:sz w:val="22"/>
+          <w:szCs w:val="22"/>
+        </w:rPr>
+        <w:t xml:space="preserve">Distribuição via Instagram Stories, newsletter e grupos de WhatsApp</w:t>
+      </w:r>
+    </w:p>
+    <w:p>
+      <w:pPr>
+        <w:pStyle w:val="ListParagraph"/>
+        <w:numPr>
+          <w:ilvl w:val="0"/>
+          <w:numId w:val="2"/>
+        </w:numPr>
+        <w:spacing w:after="80" w:line="320"/>
+      </w:pPr>
+      <w:r>
+        <w:rPr>
+          <w:rFonts w:ascii="Arial" w:cs="Arial" w:eastAsia="Arial" w:hAnsi="Arial"/>
+          <w:sz w:val="22"/>
+          <w:szCs w:val="22"/>
+        </w:rPr>
+        <w:t xml:space="preserve">Meta: 2-3 alertas por semana, construindo audiência e validando demanda</w:t>
+      </w:r>
+    </w:p>
+    <w:p>
+      <w:pPr>
+        <w:pStyle w:val="Heading3"/>
+        <w:spacing w:after="120" w:before="200"/>
+      </w:pPr>
+      <w:r>
+        <w:rPr>
+          <w:rFonts w:ascii="Arial" w:cs="Arial" w:eastAsia="Arial" w:hAnsi="Arial"/>
+          <w:b/>
+          <w:bCs/>
+          <w:color w:val="1B3A4B"/>
+          <w:sz w:val="22"/>
+          <w:szCs w:val="22"/>
+        </w:rPr>
+        <w:t xml:space="preserve">Etapa 2 — Semi-automatizado com n8n (Meses 4-9)</w:t>
+      </w:r>
+    </w:p>
+    <w:p>
+      <w:pPr>
+        <w:spacing w:after="160" w:line="320"/>
+        <w:jc w:val="both"/>
+      </w:pPr>
+      <w:r>
+        <w:rPr>
+          <w:rFonts w:ascii="Arial" w:cs="Arial" w:eastAsia="Arial" w:hAnsi="Arial"/>
+          <w:b/>
+          <w:bCs/>
+          <w:sz w:val="22"/>
+          <w:szCs w:val="22"/>
+        </w:rPr>
+        <w:t xml:space="preserve">Investimento: </w:t>
+      </w:r>
+      <w:r>
+        <w:rPr>
+          <w:rFonts w:ascii="Arial" w:cs="Arial" w:eastAsia="Arial" w:hAnsi="Arial"/>
+          <w:sz w:val="22"/>
+          <w:szCs w:val="22"/>
+        </w:rPr>
+        <w:t xml:space="preserve">~R$ 50/mês (servidor VPS para n8n self-hosted)</w:t>
+      </w:r>
+    </w:p>
+    <w:p>
+      <w:pPr>
+        <w:pStyle w:val="ListParagraph"/>
+        <w:numPr>
+          <w:ilvl w:val="0"/>
+          <w:numId w:val="2"/>
+        </w:numPr>
+        <w:spacing w:after="80" w:line="320"/>
+      </w:pPr>
+      <w:r>
+        <w:rPr>
+          <w:rFonts w:ascii="Arial" w:cs="Arial" w:eastAsia="Arial" w:hAnsi="Arial"/>
+          <w:sz w:val="22"/>
+          <w:szCs w:val="22"/>
+        </w:rPr>
+        <w:t xml:space="preserve">Implementar n8n (automação open-source) em VPS próprio</w:t>
+      </w:r>
+    </w:p>
+    <w:p>
+      <w:pPr>
+        <w:pStyle w:val="ListParagraph"/>
+        <w:numPr>
+          <w:ilvl w:val="0"/>
+          <w:numId w:val="2"/>
+        </w:numPr>
+        <w:spacing w:after="80" w:line="320"/>
+      </w:pPr>
+      <w:r>
+        <w:rPr>
+          <w:rFonts w:ascii="Arial" w:cs="Arial" w:eastAsia="Arial" w:hAnsi="Arial"/>
+          <w:sz w:val="22"/>
+          <w:szCs w:val="22"/>
+        </w:rPr>
+        <w:t xml:space="preserve">Workflows automáticos que consultam APIs de preços (Travelpayouts, Skyscanner API)</w:t>
+      </w:r>
+    </w:p>
+    <w:p>
+      <w:pPr>
+        <w:pStyle w:val="ListParagraph"/>
+        <w:numPr>
+          <w:ilvl w:val="0"/>
+          <w:numId w:val="2"/>
+        </w:numPr>
+        <w:spacing w:after="80" w:line="320"/>
+      </w:pPr>
+      <w:r>
+        <w:rPr>
+          <w:rFonts w:ascii="Arial" w:cs="Arial" w:eastAsia="Arial" w:hAnsi="Arial"/>
+          <w:sz w:val="22"/>
+          <w:szCs w:val="22"/>
+        </w:rPr>
+        <w:t xml:space="preserve">Regras configuradas: “se preço de SP→Lisboa &lt; R$ 2.500, disparar alerta”</w:t>
+      </w:r>
+    </w:p>
+    <w:p>
+      <w:pPr>
+        <w:pStyle w:val="ListParagraph"/>
+        <w:numPr>
+          <w:ilvl w:val="0"/>
+          <w:numId w:val="2"/>
+        </w:numPr>
+        <w:spacing w:after="80" w:line="320"/>
+      </w:pPr>
+      <w:r>
+        <w:rPr>
+          <w:rFonts w:ascii="Arial" w:cs="Arial" w:eastAsia="Arial" w:hAnsi="Arial"/>
+          <w:sz w:val="22"/>
+          <w:szCs w:val="22"/>
+        </w:rPr>
+        <w:t xml:space="preserve">Alertas enviados automaticamente por email (Brevo/Mailchimp) e Telegram</w:t>
+      </w:r>
+    </w:p>
+    <w:p>
+      <w:pPr>
+        <w:pStyle w:val="ListParagraph"/>
+        <w:numPr>
+          <w:ilvl w:val="0"/>
+          <w:numId w:val="2"/>
+        </w:numPr>
+        <w:spacing w:after="80" w:line="320"/>
+      </w:pPr>
+      <w:r>
+        <w:rPr>
+          <w:rFonts w:ascii="Arial" w:cs="Arial" w:eastAsia="Arial" w:hAnsi="Arial"/>
+          <w:sz w:val="22"/>
+          <w:szCs w:val="22"/>
+        </w:rPr>
+        <w:t xml:space="preserve">Dashboard interno para acompanhar tendências de preços</w:t>
+      </w:r>
+    </w:p>
+    <w:p>
+      <w:pPr>
+        <w:pStyle w:val="ListParagraph"/>
+        <w:numPr>
+          <w:ilvl w:val="0"/>
+          <w:numId w:val="2"/>
+        </w:numPr>
+        <w:spacing w:after="80" w:line="320"/>
+      </w:pPr>
+      <w:r>
+        <w:rPr>
+          <w:rFonts w:ascii="Arial" w:cs="Arial" w:eastAsia="Arial" w:hAnsi="Arial"/>
+          <w:sz w:val="22"/>
+          <w:szCs w:val="22"/>
+        </w:rPr>
+        <w:t xml:space="preserve">Meta: monitorar 20-30 rotas populares com atualização diária</w:t>
+      </w:r>
+    </w:p>
+    <w:p>
+      <w:pPr>
+        <w:pStyle w:val="Heading3"/>
+        <w:spacing w:after="120" w:before="200"/>
+      </w:pPr>
+      <w:r>
+        <w:rPr>
+          <w:rFonts w:ascii="Arial" w:cs="Arial" w:eastAsia="Arial" w:hAnsi="Arial"/>
+          <w:b/>
+          <w:bCs/>
+          <w:color w:val="1B3A4B"/>
+          <w:sz w:val="22"/>
+          <w:szCs w:val="22"/>
+        </w:rPr>
+        <w:t xml:space="preserve">Etapa 3 — Sistema Profissional com Push Notifications (Meses 9+)</w:t>
+      </w:r>
+    </w:p>
+    <w:p>
+      <w:pPr>
+        <w:spacing w:after="160" w:line="320"/>
+        <w:jc w:val="both"/>
+      </w:pPr>
+      <w:r>
+        <w:rPr>
+          <w:rFonts w:ascii="Arial" w:cs="Arial" w:eastAsia="Arial" w:hAnsi="Arial"/>
+          <w:b/>
+          <w:bCs/>
+          <w:sz w:val="22"/>
+          <w:szCs w:val="22"/>
+        </w:rPr>
+        <w:t xml:space="preserve">Investimento: </w:t>
+      </w:r>
+      <w:r>
+        <w:rPr>
+          <w:rFonts w:ascii="Arial" w:cs="Arial" w:eastAsia="Arial" w:hAnsi="Arial"/>
+          <w:sz w:val="22"/>
+          <w:szCs w:val="22"/>
+        </w:rPr>
+        <w:t xml:space="preserve">~R$ 200-500/mês (APIs + OneSignal + infraestrutura)</w:t>
+      </w:r>
+    </w:p>
+    <w:p>
+      <w:pPr>
+        <w:pStyle w:val="ListParagraph"/>
+        <w:numPr>
+          <w:ilvl w:val="0"/>
+          <w:numId w:val="2"/>
+        </w:numPr>
+        <w:spacing w:after="80" w:line="320"/>
+      </w:pPr>
+      <w:r>
+        <w:rPr>
+          <w:rFonts w:ascii="Arial" w:cs="Arial" w:eastAsia="Arial" w:hAnsi="Arial"/>
+          <w:sz w:val="22"/>
+          <w:szCs w:val="22"/>
+        </w:rPr>
+        <w:t xml:space="preserve">Integração direta com APIs de GDS (Amadeus, Sabre) para dados em tempo real</w:t>
+      </w:r>
+    </w:p>
+    <w:p>
+      <w:pPr>
+        <w:pStyle w:val="ListParagraph"/>
+        <w:numPr>
+          <w:ilvl w:val="0"/>
+          <w:numId w:val="2"/>
+        </w:numPr>
+        <w:spacing w:after="80" w:line="320"/>
+      </w:pPr>
+      <w:r>
+        <w:rPr>
+          <w:rFonts w:ascii="Arial" w:cs="Arial" w:eastAsia="Arial" w:hAnsi="Arial"/>
+          <w:sz w:val="22"/>
+          <w:szCs w:val="22"/>
+        </w:rPr>
+        <w:t xml:space="preserve">OneSignal integrado ao site para push notifications no navegador e celular</w:t>
+      </w:r>
+    </w:p>
+    <w:p>
+      <w:pPr>
+        <w:pStyle w:val="ListParagraph"/>
+        <w:numPr>
+          <w:ilvl w:val="0"/>
+          <w:numId w:val="2"/>
+        </w:numPr>
+        <w:spacing w:after="80" w:line="320"/>
+      </w:pPr>
+      <w:r>
+        <w:rPr>
+          <w:rFonts w:ascii="Arial" w:cs="Arial" w:eastAsia="Arial" w:hAnsi="Arial"/>
+          <w:sz w:val="22"/>
+          <w:szCs w:val="22"/>
+        </w:rPr>
+        <w:t xml:space="preserve">Usuário configura alertas personalizados: “Me avise quando SP→NYC ficar abaixo de R$ 3.000”</w:t>
+      </w:r>
+    </w:p>
+    <w:p>
+      <w:pPr>
+        <w:pStyle w:val="ListParagraph"/>
+        <w:numPr>
+          <w:ilvl w:val="0"/>
+          <w:numId w:val="2"/>
+        </w:numPr>
+        <w:spacing w:after="80" w:line="320"/>
+      </w:pPr>
+      <w:r>
+        <w:rPr>
+          <w:rFonts w:ascii="Arial" w:cs="Arial" w:eastAsia="Arial" w:hAnsi="Arial"/>
+          <w:sz w:val="22"/>
+          <w:szCs w:val="22"/>
+        </w:rPr>
+        <w:t xml:space="preserve">Motor de regras com machine learning básico para prever tendências de preço</w:t>
+      </w:r>
+    </w:p>
+    <w:p>
+      <w:pPr>
+        <w:pStyle w:val="ListParagraph"/>
+        <w:numPr>
+          <w:ilvl w:val="0"/>
+          <w:numId w:val="2"/>
+        </w:numPr>
+        <w:spacing w:after="80" w:line="320"/>
+      </w:pPr>
+      <w:r>
+        <w:rPr>
+          <w:rFonts w:ascii="Arial" w:cs="Arial" w:eastAsia="Arial" w:hAnsi="Arial"/>
+          <w:sz w:val="22"/>
+          <w:szCs w:val="22"/>
+        </w:rPr>
+        <w:t xml:space="preserve">Página dedicada “Alerta de Preços” no site com ranking de melhores ofertas ao vivo</w:t>
+      </w:r>
+    </w:p>
+    <w:p>
+      <w:pPr>
+        <w:pStyle w:val="ListParagraph"/>
+        <w:numPr>
+          <w:ilvl w:val="0"/>
+          <w:numId w:val="2"/>
+        </w:numPr>
+        <w:spacing w:after="80" w:line="320"/>
+      </w:pPr>
+      <w:r>
+        <w:rPr>
+          <w:rFonts w:ascii="Arial" w:cs="Arial" w:eastAsia="Arial" w:hAnsi="Arial"/>
+          <w:sz w:val="22"/>
+          <w:szCs w:val="22"/>
+        </w:rPr>
+        <w:t xml:space="preserve">Meta: monitorar 100+ rotas, enviar 5-10 alertas relevantes por semana</w:t>
+      </w:r>
+    </w:p>
+    <w:p>
+      <w:pPr>
+        <w:pStyle w:val="Heading3"/>
+        <w:spacing w:after="120" w:before="200"/>
+      </w:pPr>
+      <w:r>
+        <w:rPr>
+          <w:rFonts w:ascii="Arial" w:cs="Arial" w:eastAsia="Arial" w:hAnsi="Arial"/>
+          <w:b/>
+          <w:bCs/>
+          <w:color w:val="1B3A4B"/>
+          <w:sz w:val="22"/>
+          <w:szCs w:val="22"/>
+        </w:rPr>
+        <w:t xml:space="preserve">Considerações Legais (CDC Art. 30-35)</w:t>
+      </w:r>
+    </w:p>
+    <w:p>
+      <w:pPr>
+        <w:spacing w:after="160" w:line="320"/>
+        <w:jc w:val="both"/>
+      </w:pPr>
+      <w:r>
+        <w:rPr>
+          <w:rFonts w:ascii="Arial" w:cs="Arial" w:eastAsia="Arial" w:hAnsi="Arial"/>
+          <w:sz w:val="22"/>
+          <w:szCs w:val="22"/>
+        </w:rPr>
+        <w:t xml:space="preserve">Ao exibir preços, a Go Livoo deve incluir disclaimers claros: “Preços encontrados em [data], sujeitos a alteração. A Go Livoo não vende passagens diretamente — os preços são referentes aos parceiros indicados.” Isso protege contra obrigações do CDC que exigem que o fornecedor honre o preço anunciado, já que a Go Livoo atua como curadoria e não como vendedora.</w:t>
       </w:r>
     </w:p>
     <w:p>

</xml_diff>